<commit_message>
Add rental income progress indicators to Q1 report
https://claude.ai/code/session_01HbK9N3vZquubiFb3vE1Zm4
</commit_message>
<xml_diff>
--- a/Informe_Avance_1Q_2026_GVega.docx
+++ b/Informe_Avance_1Q_2026_GVega.docx
@@ -2,7 +2,7 @@
 <file path=word/document.xml><?xml version="1.0" encoding="utf-8"?>
 <w:document xmlns:w="http://schemas.openxmlformats.org/wordprocessingml/2006/main" xmlns:m="http://schemas.openxmlformats.org/officeDocument/2006/math" xmlns:r="http://schemas.openxmlformats.org/officeDocument/2006/relationships" xmlns:o="urn:schemas-microsoft-com:office:office" xmlns:v="urn:schemas-microsoft-com:vml" xmlns:w10="urn:schemas-microsoft-com:office:word" xmlns:a="http://schemas.openxmlformats.org/drawingml/2006/main" xmlns:pic="http://schemas.openxmlformats.org/drawingml/2006/picture" xmlns:wp="http://schemas.openxmlformats.org/drawingml/2006/wordprocessingDrawing">
   <w:body>
-    <w:bookmarkStart w:id="35" w:name="informe-de-avance-primer-trimestre-2026"/>
+    <w:bookmarkStart w:id="36" w:name="informe-de-avance-primer-trimestre-2026"/>
     <w:p>
       <w:pPr>
         <w:pStyle w:val="Heading1"/>
@@ -192,7 +192,7 @@
       </w:r>
     </w:p>
     <w:bookmarkEnd w:id="21"/>
-    <w:bookmarkStart w:id="25" w:name="Xc3505a601d9c40387bc6ddd19e1ff3e2f347fa2"/>
+    <w:bookmarkStart w:id="26" w:name="Xc3505a601d9c40387bc6ddd19e1ff3e2f347fa2"/>
     <w:p>
       <w:pPr>
         <w:pStyle w:val="Heading2"/>
@@ -704,13 +704,13 @@
       </w:tr>
     </w:tbl>
     <w:bookmarkEnd w:id="22"/>
-    <w:bookmarkStart w:id="23" w:name="indicadores-de-cumplimiento"/>
+    <w:bookmarkStart w:id="23" w:name="indicadores-de-cumplimiento-superficie"/>
     <w:p>
       <w:pPr>
         <w:pStyle w:val="Heading3"/>
       </w:pPr>
       <w:r>
-        <w:t xml:space="preserve">Indicadores de cumplimiento:</w:t>
+        <w:t xml:space="preserve">Indicadores de cumplimiento — Superficie:</w:t>
       </w:r>
     </w:p>
     <w:tbl>
@@ -907,7 +907,516 @@
       </w:tr>
     </w:tbl>
     <w:bookmarkEnd w:id="23"/>
-    <w:bookmarkStart w:id="24" w:name="observaciones"/>
+    <w:bookmarkStart w:id="24" w:name="Xfde831b7f8f8a195369dd58d8ad38caa990276a"/>
+    <w:p>
+      <w:pPr>
+        <w:pStyle w:val="Heading3"/>
+      </w:pPr>
+      <w:r>
+        <w:t xml:space="preserve">Indicadores de cumplimiento — Ingresos de renta:</w:t>
+      </w:r>
+    </w:p>
+    <w:p>
+      <w:pPr>
+        <w:pStyle w:val="FirstParagraph"/>
+      </w:pPr>
+      <w:r>
+        <w:t xml:space="preserve">El objetivo establece una meta de ingreso anual de</w:t>
+      </w:r>
+      <w:r>
+        <w:t xml:space="preserve"> </w:t>
+      </w:r>
+      <w:r>
+        <w:rPr>
+          <w:bCs/>
+          <w:b/>
+        </w:rPr>
+        <w:t xml:space="preserve">$2,000,000</w:t>
+      </w:r>
+      <w:r>
+        <w:t xml:space="preserve"> </w:t>
+      </w:r>
+      <w:r>
+        <w:t xml:space="preserve">al colocar 888 m² durante el año (equivalente a $500,000 anualizados por trimestre). La siguiente tabla muestra el avance en términos de ingreso de renta generado con las colocaciones del 1Q:</w:t>
+      </w:r>
+    </w:p>
+    <w:tbl>
+      <w:tblPr>
+        <w:tblStyle w:val="Table"/>
+        <w:tblW w:type="pct" w:w="5000"/>
+        <w:tblLook w:firstRow="1" w:lastRow="0" w:firstColumn="0" w:lastColumn="0" w:noHBand="0" w:noVBand="0" w:val="0020"/>
+        <w:jc w:val="start"/>
+      </w:tblPr>
+      <w:tblGrid>
+        <w:gridCol w:w="1131"/>
+        <w:gridCol w:w="1131"/>
+        <w:gridCol w:w="1131"/>
+        <w:gridCol w:w="1131"/>
+        <w:gridCol w:w="1131"/>
+        <w:gridCol w:w="1131"/>
+        <w:gridCol w:w="1131"/>
+      </w:tblGrid>
+      <w:tr>
+        <w:trPr>
+          <w:tblHeader w:val="true"/>
+        </w:trPr>
+        <w:tc>
+          <w:tcPr/>
+          <w:p>
+            <w:pPr>
+              <w:pStyle w:val="Compact"/>
+              <w:jc w:val="left"/>
+            </w:pPr>
+            <w:r>
+              <w:t xml:space="preserve">Arrendatario</w:t>
+            </w:r>
+          </w:p>
+        </w:tc>
+        <w:tc>
+          <w:tcPr/>
+          <w:p>
+            <w:pPr>
+              <w:pStyle w:val="Compact"/>
+              <w:jc w:val="left"/>
+            </w:pPr>
+            <w:r>
+              <w:t xml:space="preserve">Propiedad</w:t>
+            </w:r>
+          </w:p>
+        </w:tc>
+        <w:tc>
+          <w:tcPr/>
+          <w:p>
+            <w:pPr>
+              <w:pStyle w:val="Compact"/>
+              <w:jc w:val="left"/>
+            </w:pPr>
+            <w:r>
+              <w:t xml:space="preserve">Estatus</w:t>
+            </w:r>
+          </w:p>
+        </w:tc>
+        <w:tc>
+          <w:tcPr/>
+          <w:p>
+            <w:pPr>
+              <w:pStyle w:val="Compact"/>
+              <w:jc w:val="left"/>
+            </w:pPr>
+            <w:r>
+              <w:t xml:space="preserve">Renta mensual</w:t>
+            </w:r>
+          </w:p>
+        </w:tc>
+        <w:tc>
+          <w:tcPr/>
+          <w:p>
+            <w:pPr>
+              <w:pStyle w:val="Compact"/>
+              <w:jc w:val="left"/>
+            </w:pPr>
+            <w:r>
+              <w:t xml:space="preserve">Ingreso anual proyectado</w:t>
+            </w:r>
+          </w:p>
+        </w:tc>
+        <w:tc>
+          <w:tcPr/>
+          <w:p>
+            <w:pPr>
+              <w:pStyle w:val="Compact"/>
+              <w:jc w:val="left"/>
+            </w:pPr>
+            <w:r>
+              <w:t xml:space="preserve">% de la meta anual ($2 mdp)</w:t>
+            </w:r>
+          </w:p>
+        </w:tc>
+        <w:tc>
+          <w:tcPr/>
+          <w:p>
+            <w:pPr>
+              <w:pStyle w:val="Compact"/>
+              <w:jc w:val="left"/>
+            </w:pPr>
+            <w:r>
+              <w:t xml:space="preserve">% de la meta del 1Q ($500K)</w:t>
+            </w:r>
+          </w:p>
+        </w:tc>
+      </w:tr>
+      <w:tr>
+        <w:tc>
+          <w:tcPr/>
+          <w:p>
+            <w:pPr>
+              <w:pStyle w:val="Compact"/>
+              <w:jc w:val="left"/>
+            </w:pPr>
+            <w:r>
+              <w:t xml:space="preserve">Circle K</w:t>
+            </w:r>
+          </w:p>
+        </w:tc>
+        <w:tc>
+          <w:tcPr/>
+          <w:p>
+            <w:pPr>
+              <w:pStyle w:val="Compact"/>
+              <w:jc w:val="left"/>
+            </w:pPr>
+            <w:r>
+              <w:t xml:space="preserve">One Acapulco</w:t>
+            </w:r>
+          </w:p>
+        </w:tc>
+        <w:tc>
+          <w:tcPr/>
+          <w:p>
+            <w:pPr>
+              <w:pStyle w:val="Compact"/>
+              <w:jc w:val="left"/>
+            </w:pPr>
+            <w:r>
+              <w:t xml:space="preserve">Firmado</w:t>
+            </w:r>
+          </w:p>
+        </w:tc>
+        <w:tc>
+          <w:tcPr/>
+          <w:p>
+            <w:pPr>
+              <w:pStyle w:val="Compact"/>
+              <w:jc w:val="left"/>
+            </w:pPr>
+            <w:r>
+              <w:t xml:space="preserve">$38,000*</w:t>
+            </w:r>
+          </w:p>
+        </w:tc>
+        <w:tc>
+          <w:tcPr/>
+          <w:p>
+            <w:pPr>
+              <w:pStyle w:val="Compact"/>
+              <w:jc w:val="left"/>
+            </w:pPr>
+            <w:r>
+              <w:t xml:space="preserve">$456,000</w:t>
+            </w:r>
+          </w:p>
+        </w:tc>
+        <w:tc>
+          <w:tcPr/>
+          <w:p>
+            <w:pPr>
+              <w:pStyle w:val="Compact"/>
+              <w:jc w:val="left"/>
+            </w:pPr>
+            <w:r>
+              <w:t xml:space="preserve">22.8%</w:t>
+            </w:r>
+          </w:p>
+        </w:tc>
+        <w:tc>
+          <w:tcPr/>
+          <w:p>
+            <w:pPr>
+              <w:pStyle w:val="Compact"/>
+              <w:jc w:val="left"/>
+            </w:pPr>
+            <w:r>
+              <w:t xml:space="preserve">91.2%</w:t>
+            </w:r>
+          </w:p>
+        </w:tc>
+      </w:tr>
+      <w:tr>
+        <w:tc>
+          <w:tcPr/>
+          <w:p>
+            <w:pPr>
+              <w:pStyle w:val="Compact"/>
+              <w:jc w:val="left"/>
+            </w:pPr>
+            <w:r>
+              <w:t xml:space="preserve">Gloria JH</w:t>
+            </w:r>
+          </w:p>
+        </w:tc>
+        <w:tc>
+          <w:tcPr/>
+          <w:p>
+            <w:pPr>
+              <w:pStyle w:val="Compact"/>
+              <w:jc w:val="left"/>
+            </w:pPr>
+            <w:r>
+              <w:t xml:space="preserve">Plaza One Monterrey</w:t>
+            </w:r>
+          </w:p>
+        </w:tc>
+        <w:tc>
+          <w:tcPr/>
+          <w:p>
+            <w:pPr>
+              <w:pStyle w:val="Compact"/>
+              <w:jc w:val="left"/>
+            </w:pPr>
+            <w:r>
+              <w:t xml:space="preserve">En negociación</w:t>
+            </w:r>
+          </w:p>
+        </w:tc>
+        <w:tc>
+          <w:tcPr/>
+          <w:p>
+            <w:pPr>
+              <w:pStyle w:val="Compact"/>
+              <w:jc w:val="left"/>
+            </w:pPr>
+            <w:r>
+              <w:t xml:space="preserve">$25,000</w:t>
+            </w:r>
+          </w:p>
+        </w:tc>
+        <w:tc>
+          <w:tcPr/>
+          <w:p>
+            <w:pPr>
+              <w:pStyle w:val="Compact"/>
+              <w:jc w:val="left"/>
+            </w:pPr>
+            <w:r>
+              <w:t xml:space="preserve">$300,000</w:t>
+            </w:r>
+          </w:p>
+        </w:tc>
+        <w:tc>
+          <w:tcPr/>
+          <w:p>
+            <w:pPr>
+              <w:pStyle w:val="Compact"/>
+              <w:jc w:val="left"/>
+            </w:pPr>
+            <w:r>
+              <w:t xml:space="preserve">15.0%</w:t>
+            </w:r>
+          </w:p>
+        </w:tc>
+        <w:tc>
+          <w:tcPr/>
+          <w:p>
+            <w:pPr>
+              <w:pStyle w:val="Compact"/>
+              <w:jc w:val="left"/>
+            </w:pPr>
+            <w:r>
+              <w:t xml:space="preserve">60.0%</w:t>
+            </w:r>
+          </w:p>
+        </w:tc>
+      </w:tr>
+      <w:tr>
+        <w:tc>
+          <w:tcPr/>
+          <w:p>
+            <w:pPr>
+              <w:pStyle w:val="Compact"/>
+              <w:jc w:val="left"/>
+            </w:pPr>
+            <w:r>
+              <w:rPr>
+                <w:bCs/>
+                <w:b/>
+              </w:rPr>
+              <w:t xml:space="preserve">Total con prospecto</w:t>
+            </w:r>
+          </w:p>
+        </w:tc>
+        <w:tc>
+          <w:tcPr/>
+          <w:p>
+            <w:pPr>
+              <w:pStyle w:val="Compact"/>
+            </w:pPr>
+          </w:p>
+        </w:tc>
+        <w:tc>
+          <w:tcPr/>
+          <w:p>
+            <w:pPr>
+              <w:pStyle w:val="Compact"/>
+            </w:pPr>
+          </w:p>
+        </w:tc>
+        <w:tc>
+          <w:tcPr/>
+          <w:p>
+            <w:pPr>
+              <w:pStyle w:val="Compact"/>
+              <w:jc w:val="left"/>
+            </w:pPr>
+            <w:r>
+              <w:rPr>
+                <w:bCs/>
+                <w:b/>
+              </w:rPr>
+              <w:t xml:space="preserve">$63,000</w:t>
+            </w:r>
+          </w:p>
+        </w:tc>
+        <w:tc>
+          <w:tcPr/>
+          <w:p>
+            <w:pPr>
+              <w:pStyle w:val="Compact"/>
+              <w:jc w:val="left"/>
+            </w:pPr>
+            <w:r>
+              <w:rPr>
+                <w:bCs/>
+                <w:b/>
+              </w:rPr>
+              <w:t xml:space="preserve">$756,000</w:t>
+            </w:r>
+          </w:p>
+        </w:tc>
+        <w:tc>
+          <w:tcPr/>
+          <w:p>
+            <w:pPr>
+              <w:pStyle w:val="Compact"/>
+              <w:jc w:val="left"/>
+            </w:pPr>
+            <w:r>
+              <w:rPr>
+                <w:bCs/>
+                <w:b/>
+              </w:rPr>
+              <w:t xml:space="preserve">37.8%</w:t>
+            </w:r>
+          </w:p>
+        </w:tc>
+        <w:tc>
+          <w:tcPr/>
+          <w:p>
+            <w:pPr>
+              <w:pStyle w:val="Compact"/>
+              <w:jc w:val="left"/>
+            </w:pPr>
+            <w:r>
+              <w:rPr>
+                <w:bCs/>
+                <w:b/>
+              </w:rPr>
+              <w:t xml:space="preserve">151.2%</w:t>
+            </w:r>
+            <w:r>
+              <w:t xml:space="preserve"> </w:t>
+            </w:r>
+            <w:r>
+              <w:t xml:space="preserve">✓</w:t>
+            </w:r>
+          </w:p>
+        </w:tc>
+      </w:tr>
+    </w:tbl>
+    <w:p>
+      <w:pPr>
+        <w:pStyle w:val="BodyText"/>
+      </w:pPr>
+      <w:r>
+        <w:t xml:space="preserve">*La renta de Circle K corresponde a $38,000 o el 8% de las ventas netas mensuales, lo que resulte mayor; se considera la renta base mínima garantizada para efectos del cálculo.</w:t>
+      </w:r>
+    </w:p>
+    <w:p>
+      <w:pPr>
+        <w:pStyle w:val="BodyText"/>
+      </w:pPr>
+      <w:r>
+        <w:rPr>
+          <w:bCs/>
+          <w:b/>
+        </w:rPr>
+        <w:t xml:space="preserve">Interpretación:</w:t>
+      </w:r>
+      <w:r>
+        <w:t xml:space="preserve"> </w:t>
+      </w:r>
+      <w:r>
+        <w:t xml:space="preserve">- Con el contrato firmado de Circle K, el área genera el</w:t>
+      </w:r>
+      <w:r>
+        <w:t xml:space="preserve"> </w:t>
+      </w:r>
+      <w:r>
+        <w:rPr>
+          <w:bCs/>
+          <w:b/>
+        </w:rPr>
+        <w:t xml:space="preserve">91.2%</w:t>
+      </w:r>
+      <w:r>
+        <w:t xml:space="preserve"> </w:t>
+      </w:r>
+      <w:r>
+        <w:t xml:space="preserve">del ingreso anualizado esperado para el primer trimestre.</w:t>
+      </w:r>
+      <w:r>
+        <w:t xml:space="preserve"> </w:t>
+      </w:r>
+      <w:r>
+        <w:t xml:space="preserve">- De cerrarse la negociación con Gloria JH, el ingreso anualizado del 1Q alcanzaría los</w:t>
+      </w:r>
+      <w:r>
+        <w:t xml:space="preserve"> </w:t>
+      </w:r>
+      <w:r>
+        <w:rPr>
+          <w:bCs/>
+          <w:b/>
+        </w:rPr>
+        <w:t xml:space="preserve">$756,000</w:t>
+      </w:r>
+      <w:r>
+        <w:t xml:space="preserve">, representando el</w:t>
+      </w:r>
+      <w:r>
+        <w:t xml:space="preserve"> </w:t>
+      </w:r>
+      <w:r>
+        <w:rPr>
+          <w:bCs/>
+          <w:b/>
+        </w:rPr>
+        <w:t xml:space="preserve">151.2%</w:t>
+      </w:r>
+      <w:r>
+        <w:t xml:space="preserve"> </w:t>
+      </w:r>
+      <w:r>
+        <w:t xml:space="preserve">de la meta trimestral de ingresos y el</w:t>
+      </w:r>
+      <w:r>
+        <w:t xml:space="preserve"> </w:t>
+      </w:r>
+      <w:r>
+        <w:rPr>
+          <w:bCs/>
+          <w:b/>
+        </w:rPr>
+        <w:t xml:space="preserve">37.8%</w:t>
+      </w:r>
+      <w:r>
+        <w:t xml:space="preserve"> </w:t>
+      </w:r>
+      <w:r>
+        <w:t xml:space="preserve">de la meta anual total.</w:t>
+      </w:r>
+    </w:p>
+    <w:bookmarkEnd w:id="24"/>
+    <w:bookmarkStart w:id="25" w:name="observaciones"/>
     <w:p>
       <w:pPr>
         <w:pStyle w:val="Heading3"/>
@@ -931,9 +1440,9 @@
         </w:pict>
       </w:r>
     </w:p>
-    <w:bookmarkEnd w:id="24"/>
     <w:bookmarkEnd w:id="25"/>
-    <w:bookmarkStart w:id="28" w:name="X65279fe2b87888ce35f4899b0418532b7a04fde"/>
+    <w:bookmarkEnd w:id="26"/>
+    <w:bookmarkStart w:id="29" w:name="X65279fe2b87888ce35f4899b0418532b7a04fde"/>
     <w:p>
       <w:pPr>
         <w:pStyle w:val="Heading2"/>
@@ -966,7 +1475,7 @@
         <w:t xml:space="preserve">Independizar los energéticos de los Arrendatarios considerando la viabilidad en la infraestructura eléctrica e hídrica de cada Hotel. (Pendiente diagnóstico)</w:t>
       </w:r>
     </w:p>
-    <w:bookmarkStart w:id="26" w:name="avance-al-1q-1"/>
+    <w:bookmarkStart w:id="27" w:name="avance-al-1q-1"/>
     <w:p>
       <w:pPr>
         <w:pStyle w:val="Heading3"/>
@@ -1143,8 +1652,8 @@
         </w:tc>
       </w:tr>
     </w:tbl>
-    <w:bookmarkEnd w:id="26"/>
-    <w:bookmarkStart w:id="27" w:name="observaciones-1"/>
+    <w:bookmarkEnd w:id="27"/>
+    <w:bookmarkStart w:id="28" w:name="observaciones-1"/>
     <w:p>
       <w:pPr>
         <w:pStyle w:val="Heading3"/>
@@ -1168,9 +1677,9 @@
         </w:pict>
       </w:r>
     </w:p>
-    <w:bookmarkEnd w:id="27"/>
     <w:bookmarkEnd w:id="28"/>
-    <w:bookmarkStart w:id="32" w:name="X02a2dcd84a5a54b335f7b785dd211b86d43bb8b"/>
+    <w:bookmarkEnd w:id="29"/>
+    <w:bookmarkStart w:id="33" w:name="X02a2dcd84a5a54b335f7b785dd211b86d43bb8b"/>
     <w:p>
       <w:pPr>
         <w:pStyle w:val="Heading2"/>
@@ -1223,7 +1732,7 @@
         <w:t xml:space="preserve">ii) Generación de reportes mensuales, cálculo de intereses moratorios, almacenamiento y seguimiento de vigencia de pólizas, permisos, licencias y documentación legal de los arrendatarios.</w:t>
       </w:r>
     </w:p>
-    <w:bookmarkStart w:id="29" w:name="X9fc3c3eb91959d391313ca3893025f213147ceb"/>
+    <w:bookmarkStart w:id="30" w:name="X9fc3c3eb91959d391313ca3893025f213147ceb"/>
     <w:p>
       <w:pPr>
         <w:pStyle w:val="Heading3"/>
@@ -1266,8 +1775,8 @@
         <w:t xml:space="preserve">. Esta decisión responde a la identificación de una alternativa de mayor valor estratégico para el área.</w:t>
       </w:r>
     </w:p>
-    <w:bookmarkEnd w:id="29"/>
-    <w:bookmarkStart w:id="30" w:name="X5e560540893c03e3ca6ea86c43efc4f7de60089"/>
+    <w:bookmarkEnd w:id="30"/>
+    <w:bookmarkStart w:id="31" w:name="X5e560540893c03e3ca6ea86c43efc4f7de60089"/>
     <w:p>
       <w:pPr>
         <w:pStyle w:val="Heading3"/>
@@ -1572,8 +2081,8 @@
         <w:t xml:space="preserve">✓ Almacenamiento y seguimiento de vigencia de pólizas, permisos, licencias y documentación legal de arrendatarios</w:t>
       </w:r>
     </w:p>
-    <w:bookmarkEnd w:id="30"/>
-    <w:bookmarkStart w:id="31" w:name="observaciones-2"/>
+    <w:bookmarkEnd w:id="31"/>
+    <w:bookmarkStart w:id="32" w:name="observaciones-2"/>
     <w:p>
       <w:pPr>
         <w:pStyle w:val="Heading3"/>
@@ -1610,9 +2119,9 @@
         </w:pict>
       </w:r>
     </w:p>
-    <w:bookmarkEnd w:id="31"/>
     <w:bookmarkEnd w:id="32"/>
-    <w:bookmarkStart w:id="33" w:name="resumen-de-cumplimiento-1q-2026"/>
+    <w:bookmarkEnd w:id="33"/>
+    <w:bookmarkStart w:id="34" w:name="resumen-de-cumplimiento-1q-2026"/>
     <w:p>
       <w:pPr>
         <w:pStyle w:val="Heading2"/>
@@ -1845,8 +2354,8 @@
         </w:pict>
       </w:r>
     </w:p>
-    <w:bookmarkEnd w:id="33"/>
-    <w:bookmarkStart w:id="34" w:name="próximos-pasos"/>
+    <w:bookmarkEnd w:id="34"/>
+    <w:bookmarkStart w:id="35" w:name="próximos-pasos"/>
     <w:p>
       <w:pPr>
         <w:pStyle w:val="Heading2"/>
@@ -1940,8 +2449,8 @@
         <w:t xml:space="preserve">Elaborado por: Gerardo Vega Quinto — Área de Arrendamiento, Fibra Hotel Corporativo</w:t>
       </w:r>
     </w:p>
-    <w:bookmarkEnd w:id="34"/>
     <w:bookmarkEnd w:id="35"/>
+    <w:bookmarkEnd w:id="36"/>
     <w:sectPr/>
   </w:body>
 </w:document>

</xml_diff>

<commit_message>
Remove Gloria JH from income compliance indicators
https://claude.ai/code/session_01HbK9N3vZquubiFb3vE1Zm4
</commit_message>
<xml_diff>
--- a/Informe_Avance_1Q_2026_GVega.docx
+++ b/Informe_Avance_1Q_2026_GVega.docx
@@ -1126,197 +1126,11 @@
               <w:jc w:val="left"/>
             </w:pPr>
             <w:r>
-              <w:t xml:space="preserve">91.2%</w:t>
-            </w:r>
-          </w:p>
-        </w:tc>
-      </w:tr>
-      <w:tr>
-        <w:tc>
-          <w:tcPr/>
-          <w:p>
-            <w:pPr>
-              <w:pStyle w:val="Compact"/>
-              <w:jc w:val="left"/>
-            </w:pPr>
-            <w:r>
-              <w:t xml:space="preserve">Gloria JH</w:t>
-            </w:r>
-          </w:p>
-        </w:tc>
-        <w:tc>
-          <w:tcPr/>
-          <w:p>
-            <w:pPr>
-              <w:pStyle w:val="Compact"/>
-              <w:jc w:val="left"/>
-            </w:pPr>
-            <w:r>
-              <w:t xml:space="preserve">Plaza One Monterrey</w:t>
-            </w:r>
-          </w:p>
-        </w:tc>
-        <w:tc>
-          <w:tcPr/>
-          <w:p>
-            <w:pPr>
-              <w:pStyle w:val="Compact"/>
-              <w:jc w:val="left"/>
-            </w:pPr>
-            <w:r>
-              <w:t xml:space="preserve">En negociación</w:t>
-            </w:r>
-          </w:p>
-        </w:tc>
-        <w:tc>
-          <w:tcPr/>
-          <w:p>
-            <w:pPr>
-              <w:pStyle w:val="Compact"/>
-              <w:jc w:val="left"/>
-            </w:pPr>
-            <w:r>
-              <w:t xml:space="preserve">$25,000</w:t>
-            </w:r>
-          </w:p>
-        </w:tc>
-        <w:tc>
-          <w:tcPr/>
-          <w:p>
-            <w:pPr>
-              <w:pStyle w:val="Compact"/>
-              <w:jc w:val="left"/>
-            </w:pPr>
-            <w:r>
-              <w:t xml:space="preserve">$300,000</w:t>
-            </w:r>
-          </w:p>
-        </w:tc>
-        <w:tc>
-          <w:tcPr/>
-          <w:p>
-            <w:pPr>
-              <w:pStyle w:val="Compact"/>
-              <w:jc w:val="left"/>
-            </w:pPr>
-            <w:r>
-              <w:t xml:space="preserve">15.0%</w:t>
-            </w:r>
-          </w:p>
-        </w:tc>
-        <w:tc>
-          <w:tcPr/>
-          <w:p>
-            <w:pPr>
-              <w:pStyle w:val="Compact"/>
-              <w:jc w:val="left"/>
-            </w:pPr>
-            <w:r>
-              <w:t xml:space="preserve">60.0%</w:t>
-            </w:r>
-          </w:p>
-        </w:tc>
-      </w:tr>
-      <w:tr>
-        <w:tc>
-          <w:tcPr/>
-          <w:p>
-            <w:pPr>
-              <w:pStyle w:val="Compact"/>
-              <w:jc w:val="left"/>
-            </w:pPr>
-            <w:r>
               <w:rPr>
                 <w:bCs/>
                 <w:b/>
               </w:rPr>
-              <w:t xml:space="preserve">Total con prospecto</w:t>
-            </w:r>
-          </w:p>
-        </w:tc>
-        <w:tc>
-          <w:tcPr/>
-          <w:p>
-            <w:pPr>
-              <w:pStyle w:val="Compact"/>
-            </w:pPr>
-          </w:p>
-        </w:tc>
-        <w:tc>
-          <w:tcPr/>
-          <w:p>
-            <w:pPr>
-              <w:pStyle w:val="Compact"/>
-            </w:pPr>
-          </w:p>
-        </w:tc>
-        <w:tc>
-          <w:tcPr/>
-          <w:p>
-            <w:pPr>
-              <w:pStyle w:val="Compact"/>
-              <w:jc w:val="left"/>
-            </w:pPr>
-            <w:r>
-              <w:rPr>
-                <w:bCs/>
-                <w:b/>
-              </w:rPr>
-              <w:t xml:space="preserve">$63,000</w:t>
-            </w:r>
-          </w:p>
-        </w:tc>
-        <w:tc>
-          <w:tcPr/>
-          <w:p>
-            <w:pPr>
-              <w:pStyle w:val="Compact"/>
-              <w:jc w:val="left"/>
-            </w:pPr>
-            <w:r>
-              <w:rPr>
-                <w:bCs/>
-                <w:b/>
-              </w:rPr>
-              <w:t xml:space="preserve">$756,000</w:t>
-            </w:r>
-          </w:p>
-        </w:tc>
-        <w:tc>
-          <w:tcPr/>
-          <w:p>
-            <w:pPr>
-              <w:pStyle w:val="Compact"/>
-              <w:jc w:val="left"/>
-            </w:pPr>
-            <w:r>
-              <w:rPr>
-                <w:bCs/>
-                <w:b/>
-              </w:rPr>
-              <w:t xml:space="preserve">37.8%</w:t>
-            </w:r>
-          </w:p>
-        </w:tc>
-        <w:tc>
-          <w:tcPr/>
-          <w:p>
-            <w:pPr>
-              <w:pStyle w:val="Compact"/>
-              <w:jc w:val="left"/>
-            </w:pPr>
-            <w:r>
-              <w:rPr>
-                <w:bCs/>
-                <w:b/>
-              </w:rPr>
-              <w:t xml:space="preserve">151.2%</w:t>
-            </w:r>
-            <w:r>
-              <w:t xml:space="preserve"> </w:t>
-            </w:r>
-            <w:r>
-              <w:t xml:space="preserve">✓</w:t>
+              <w:t xml:space="preserve">91.2%</w:t>
             </w:r>
           </w:p>
         </w:tc>
@@ -1361,13 +1175,7 @@
         <w:t xml:space="preserve"> </w:t>
       </w:r>
       <w:r>
-        <w:t xml:space="preserve">del ingreso anualizado esperado para el primer trimestre.</w:t>
-      </w:r>
-      <w:r>
-        <w:t xml:space="preserve"> </w:t>
-      </w:r>
-      <w:r>
-        <w:t xml:space="preserve">- De cerrarse la negociación con Gloria JH, el ingreso anualizado del 1Q alcanzaría los</w:t>
+        <w:t xml:space="preserve">del ingreso anualizado esperado para el primer trimestre, equivalente al</w:t>
       </w:r>
       <w:r>
         <w:t xml:space="preserve"> </w:t>
@@ -1377,42 +1185,13 @@
           <w:bCs/>
           <w:b/>
         </w:rPr>
-        <w:t xml:space="preserve">$756,000</w:t>
-      </w:r>
-      <w:r>
-        <w:t xml:space="preserve">, representando el</w:t>
+        <w:t xml:space="preserve">22.8%</w:t>
       </w:r>
       <w:r>
         <w:t xml:space="preserve"> </w:t>
       </w:r>
       <w:r>
-        <w:rPr>
-          <w:bCs/>
-          <w:b/>
-        </w:rPr>
-        <w:t xml:space="preserve">151.2%</w:t>
-      </w:r>
-      <w:r>
-        <w:t xml:space="preserve"> </w:t>
-      </w:r>
-      <w:r>
-        <w:t xml:space="preserve">de la meta trimestral de ingresos y el</w:t>
-      </w:r>
-      <w:r>
-        <w:t xml:space="preserve"> </w:t>
-      </w:r>
-      <w:r>
-        <w:rPr>
-          <w:bCs/>
-          <w:b/>
-        </w:rPr>
-        <w:t xml:space="preserve">37.8%</w:t>
-      </w:r>
-      <w:r>
-        <w:t xml:space="preserve"> </w:t>
-      </w:r>
-      <w:r>
-        <w:t xml:space="preserve">de la meta anual total.</w:t>
+        <w:t xml:space="preserve">de la meta anual de $2,000,000.</w:t>
       </w:r>
     </w:p>
     <w:bookmarkEnd w:id="24"/>

</xml_diff>

<commit_message>
Apply justified text alignment to PDF and Word report
https://claude.ai/code/session_01HbK9N3vZquubiFb3vE1Zm4
</commit_message>
<xml_diff>
--- a/Informe_Avance_1Q_2026_GVega.docx
+++ b/Informe_Avance_1Q_2026_GVega.docx
@@ -21,6 +21,9 @@
       </w:r>
     </w:p>
     <w:p>
+      <w:pPr>
+        <w:jc w:val="both"/>
+      </w:pPr>
       <w:r>
         <w:pict>
           <v:rect style="width:0;height:1.5pt" o:hralign="center" o:hrstd="t" o:hr="t"/>
@@ -160,6 +163,9 @@
       </w:tr>
     </w:tbl>
     <w:p>
+      <w:pPr>
+        <w:jc w:val="both"/>
+      </w:pPr>
       <w:r>
         <w:pict>
           <v:rect style="width:0;height:1.5pt" o:hralign="center" o:hrstd="t" o:hr="t"/>
@@ -179,12 +185,16 @@
     <w:p>
       <w:pPr>
         <w:pStyle w:val="FirstParagraph"/>
+        <w:jc w:val="both"/>
       </w:pPr>
       <w:r>
         <w:t xml:space="preserve">El presente informe documenta el avance de los tres objetivos establecidos para el ejercicio 2026 al cierre del primer trimestre. Se reporta un logro concreto y formalizado en el Objetivo 1, alcanzando el 90.1% de la meta trimestral de colocación de nuevos arrendatarios, con un contrato adicional en negociación avanzada que, de cerrarse, superaría la meta en un 32%. El Objetivo 2 permanece en espera del diagnóstico global de infraestructura. El Objetivo 3 registra un avance significativo mediante el desarrollo interno de una plataforma propia con Inteligencia Artificial, en sustitución de la solución WiseCricket originalmente contemplada, cubriendo la totalidad de las funcionalidades previstas en el objetivo.</w:t>
       </w:r>
     </w:p>
     <w:p>
+      <w:pPr>
+        <w:jc w:val="both"/>
+      </w:pPr>
       <w:r>
         <w:pict>
           <v:rect style="width:0;height:1.5pt" o:hralign="center" o:hrstd="t" o:hr="t"/>
@@ -204,6 +214,7 @@
     <w:p>
       <w:pPr>
         <w:pStyle w:val="FirstParagraph"/>
+        <w:jc w:val="both"/>
       </w:pPr>
       <w:r>
         <w:rPr>
@@ -216,6 +227,7 @@
     <w:p>
       <w:pPr>
         <w:pStyle w:val="BlockText"/>
+        <w:jc w:val="both"/>
       </w:pPr>
       <w:r>
         <w:rPr>
@@ -237,6 +249,7 @@
     <w:p>
       <w:pPr>
         <w:pStyle w:val="FirstParagraph"/>
+        <w:jc w:val="both"/>
       </w:pPr>
       <w:r>
         <w:rPr>
@@ -249,6 +262,7 @@
     <w:p>
       <w:pPr>
         <w:pStyle w:val="BodyText"/>
+        <w:jc w:val="both"/>
       </w:pPr>
       <w:r>
         <w:t xml:space="preserve">Se logró la colocación y formalización de un contrato de arrendamiento con la cadena</w:t>
@@ -474,6 +488,7 @@
     <w:p>
       <w:pPr>
         <w:pStyle w:val="BodyText"/>
+        <w:jc w:val="both"/>
       </w:pPr>
       <w:r>
         <w:t xml:space="preserve">Este contrato representa una</w:t>
@@ -495,6 +510,7 @@
     <w:p>
       <w:pPr>
         <w:pStyle w:val="BodyText"/>
+        <w:jc w:val="both"/>
       </w:pPr>
       <w:r>
         <w:rPr>
@@ -507,6 +523,7 @@
     <w:p>
       <w:pPr>
         <w:pStyle w:val="BodyText"/>
+        <w:jc w:val="both"/>
       </w:pPr>
       <w:r>
         <w:t xml:space="preserve">Adicionalmente, se tiene en proceso de cierre un segundo arrendamiento con las siguientes características:</w:t>
@@ -919,6 +936,7 @@
     <w:p>
       <w:pPr>
         <w:pStyle w:val="FirstParagraph"/>
+        <w:jc w:val="both"/>
       </w:pPr>
       <w:r>
         <w:t xml:space="preserve">El objetivo establece una meta de ingreso anual de</w:t>
@@ -1139,6 +1157,7 @@
     <w:p>
       <w:pPr>
         <w:pStyle w:val="BodyText"/>
+        <w:jc w:val="both"/>
       </w:pPr>
       <w:r>
         <w:t xml:space="preserve">*La renta de Circle K corresponde a $38,000 o el 8% de las ventas netas mensuales, lo que resulte mayor; se considera la renta base mínima garantizada para efectos del cálculo.</w:t>
@@ -1147,6 +1166,7 @@
     <w:p>
       <w:pPr>
         <w:pStyle w:val="BodyText"/>
+        <w:jc w:val="both"/>
       </w:pPr>
       <w:r>
         <w:rPr>
@@ -1207,12 +1227,16 @@
     <w:p>
       <w:pPr>
         <w:pStyle w:val="FirstParagraph"/>
+        <w:jc w:val="both"/>
       </w:pPr>
       <w:r>
         <w:t xml:space="preserve">El contrato con Circle K se encuentra en plena vigencia y representa un avance sólido respecto a la meta trimestral. La operación fue gestionada cumpliendo los criterios de elegibilidad establecidos en el objetivo (locales con condiciones mínimas indispensables para operar). El prospecto en negociación, de concretarse, situaría el cumplimiento del 1Q por encima de la meta establecida.</w:t>
       </w:r>
     </w:p>
     <w:p>
+      <w:pPr>
+        <w:jc w:val="both"/>
+      </w:pPr>
       <w:r>
         <w:pict>
           <v:rect style="width:0;height:1.5pt" o:hralign="center" o:hrstd="t" o:hr="t"/>
@@ -1233,6 +1257,7 @@
     <w:p>
       <w:pPr>
         <w:pStyle w:val="FirstParagraph"/>
+        <w:jc w:val="both"/>
       </w:pPr>
       <w:r>
         <w:rPr>
@@ -1245,6 +1270,7 @@
     <w:p>
       <w:pPr>
         <w:pStyle w:val="BlockText"/>
+        <w:jc w:val="both"/>
       </w:pPr>
       <w:r>
         <w:rPr>
@@ -1266,6 +1292,7 @@
     <w:p>
       <w:pPr>
         <w:pStyle w:val="FirstParagraph"/>
+        <w:jc w:val="both"/>
       </w:pPr>
       <w:r>
         <w:t xml:space="preserve">El avance de este objetivo está condicionado a la realización del</w:t>
@@ -1303,6 +1330,7 @@
     <w:p>
       <w:pPr>
         <w:pStyle w:val="BodyText"/>
+        <w:jc w:val="both"/>
       </w:pPr>
       <w:r>
         <w:t xml:space="preserve">Se ha mantenido coordinación con el área de mantenimiento de cada hotel para evaluar la factibilidad técnica de la independización; sin embargo, hasta no contar con el diagnóstico formal, no es posible establecer un plan de acción con alcances y tiempos definidos.</w:t>
@@ -1444,12 +1472,16 @@
     <w:p>
       <w:pPr>
         <w:pStyle w:val="FirstParagraph"/>
+        <w:jc w:val="both"/>
       </w:pPr>
       <w:r>
         <w:t xml:space="preserve">Este objetivo no registra avance cuantificable en el 1Q. Su ejecución depende directamente de la conclusión del diagnóstico global. Se recomienda priorizar la realización del diagnóstico en el 2Q para no comprometer el cumplimiento anual del objetivo.</w:t>
       </w:r>
     </w:p>
     <w:p>
+      <w:pPr>
+        <w:jc w:val="both"/>
+      </w:pPr>
       <w:r>
         <w:pict>
           <v:rect style="width:0;height:1.5pt" o:hralign="center" o:hrstd="t" o:hr="t"/>
@@ -1470,6 +1502,7 @@
     <w:p>
       <w:pPr>
         <w:pStyle w:val="FirstParagraph"/>
+        <w:jc w:val="both"/>
       </w:pPr>
       <w:r>
         <w:rPr>
@@ -1482,6 +1515,7 @@
     <w:p>
       <w:pPr>
         <w:pStyle w:val="BlockText"/>
+        <w:jc w:val="both"/>
       </w:pPr>
       <w:r>
         <w:rPr>
@@ -1523,6 +1557,7 @@
     <w:p>
       <w:pPr>
         <w:pStyle w:val="FirstParagraph"/>
+        <w:jc w:val="both"/>
       </w:pPr>
       <w:r>
         <w:t xml:space="preserve">Durante el primer trimestre se determinó que la plataforma</w:t>
@@ -1567,6 +1602,7 @@
     <w:p>
       <w:pPr>
         <w:pStyle w:val="FirstParagraph"/>
+        <w:jc w:val="both"/>
       </w:pPr>
       <w:r>
         <w:t xml:space="preserve">En sustitución de WiseCricket, el equipo de Arrendamiento está desarrollando</w:t>
@@ -1779,6 +1815,7 @@
     <w:p>
       <w:pPr>
         <w:pStyle w:val="BodyText"/>
+        <w:jc w:val="both"/>
       </w:pPr>
       <w:r>
         <w:rPr>
@@ -1795,6 +1832,7 @@
           <w:numId w:val="1001"/>
         </w:numPr>
         <w:pStyle w:val="Compact"/>
+        <w:jc w:val="both"/>
       </w:pPr>
       <w:r>
         <w:t xml:space="preserve">✓ Interpretación de contratos de arrendamiento y convenios</w:t>
@@ -1807,6 +1845,7 @@
           <w:numId w:val="1001"/>
         </w:numPr>
         <w:pStyle w:val="Compact"/>
+        <w:jc w:val="both"/>
       </w:pPr>
       <w:r>
         <w:t xml:space="preserve">✓ Cálculo y control de incrementos anuales de renta</w:t>
@@ -1819,6 +1858,7 @@
           <w:numId w:val="1001"/>
         </w:numPr>
         <w:pStyle w:val="Compact"/>
+        <w:jc w:val="both"/>
       </w:pPr>
       <w:r>
         <w:t xml:space="preserve">✓ Enlace directo con CFDIs</w:t>
@@ -1831,6 +1871,7 @@
           <w:numId w:val="1001"/>
         </w:numPr>
         <w:pStyle w:val="Compact"/>
+        <w:jc w:val="both"/>
       </w:pPr>
       <w:r>
         <w:t xml:space="preserve">✓ Generación de reportes mensuales</w:t>
@@ -1843,6 +1884,7 @@
           <w:numId w:val="1001"/>
         </w:numPr>
         <w:pStyle w:val="Compact"/>
+        <w:jc w:val="both"/>
       </w:pPr>
       <w:r>
         <w:t xml:space="preserve">✓ Cálculo de intereses moratorios</w:t>
@@ -1855,6 +1897,7 @@
           <w:numId w:val="1001"/>
         </w:numPr>
         <w:pStyle w:val="Compact"/>
+        <w:jc w:val="both"/>
       </w:pPr>
       <w:r>
         <w:t xml:space="preserve">✓ Almacenamiento y seguimiento de vigencia de pólizas, permisos, licencias y documentación legal de arrendatarios</w:t>
@@ -1873,6 +1916,7 @@
     <w:p>
       <w:pPr>
         <w:pStyle w:val="FirstParagraph"/>
+        <w:jc w:val="both"/>
       </w:pPr>
       <w:r>
         <w:t xml:space="preserve">Se considera el Objetivo 3 como</w:t>
@@ -1892,6 +1936,9 @@
       </w:r>
     </w:p>
     <w:p>
+      <w:pPr>
+        <w:jc w:val="both"/>
+      </w:pPr>
       <w:r>
         <w:pict>
           <v:rect style="width:0;height:1.5pt" o:hralign="center" o:hrstd="t" o:hr="t"/>
@@ -2127,6 +2174,9 @@
       </w:tr>
     </w:tbl>
     <w:p>
+      <w:pPr>
+        <w:jc w:val="both"/>
+      </w:pPr>
       <w:r>
         <w:pict>
           <v:rect style="width:0;height:1.5pt" o:hralign="center" o:hrstd="t" o:hr="t"/>
@@ -2150,6 +2200,7 @@
           <w:numId w:val="1002"/>
         </w:numPr>
         <w:pStyle w:val="Compact"/>
+        <w:jc w:val="both"/>
       </w:pPr>
       <w:r>
         <w:rPr>
@@ -2172,6 +2223,7 @@
           <w:numId w:val="1002"/>
         </w:numPr>
         <w:pStyle w:val="Compact"/>
+        <w:jc w:val="both"/>
       </w:pPr>
       <w:r>
         <w:rPr>
@@ -2194,6 +2246,7 @@
           <w:numId w:val="1002"/>
         </w:numPr>
         <w:pStyle w:val="Compact"/>
+        <w:jc w:val="both"/>
       </w:pPr>
       <w:r>
         <w:rPr>
@@ -2210,6 +2263,9 @@
       </w:r>
     </w:p>
     <w:p>
+      <w:pPr>
+        <w:jc w:val="both"/>
+      </w:pPr>
       <w:r>
         <w:pict>
           <v:rect style="width:0;height:1.5pt" o:hralign="center" o:hrstd="t" o:hr="t"/>
@@ -2219,6 +2275,7 @@
     <w:p>
       <w:pPr>
         <w:pStyle w:val="FirstParagraph"/>
+        <w:jc w:val="both"/>
       </w:pPr>
       <w:r>
         <w:rPr>

</xml_diff>

<commit_message>
Recalculate Circle K income for Jun-Dec 2026 period (7 months)
https://claude.ai/code/session_01HbK9N3vZquubiFb3vE1Zm4
</commit_message>
<xml_diff>
--- a/Informe_Avance_1Q_2026_GVega.docx
+++ b/Informe_Avance_1Q_2026_GVega.docx
@@ -491,7 +491,7 @@
         <w:jc w:val="both"/>
       </w:pPr>
       <w:r>
-        <w:t xml:space="preserve">Este contrato representa una</w:t>
+        <w:t xml:space="preserve">Este contrato representa una renta base garantizada mínima de</w:t>
       </w:r>
       <w:r>
         <w:t xml:space="preserve"> </w:t>
@@ -501,10 +501,42 @@
           <w:bCs/>
           <w:b/>
         </w:rPr>
-        <w:t xml:space="preserve">renta base garantizada mínima de $456,000 anuales</w:t>
-      </w:r>
-      <w:r>
-        <w:t xml:space="preserve">, sujeta a incremento en función del desempeño de ventas del arrendatario.</w:t>
+        <w:t xml:space="preserve">$38,000 mensuales</w:t>
+      </w:r>
+      <w:r>
+        <w:t xml:space="preserve"> </w:t>
+      </w:r>
+      <w:r>
+        <w:t xml:space="preserve">($456,000 anualizados), con inicio de vigencia en</w:t>
+      </w:r>
+      <w:r>
+        <w:t xml:space="preserve"> </w:t>
+      </w:r>
+      <w:r>
+        <w:rPr>
+          <w:bCs/>
+          <w:b/>
+        </w:rPr>
+        <w:t xml:space="preserve">junio de 2026</w:t>
+      </w:r>
+      <w:r>
+        <w:t xml:space="preserve">, por lo que el ingreso efectivo para el ejercicio 2026 es de</w:t>
+      </w:r>
+      <w:r>
+        <w:t xml:space="preserve"> </w:t>
+      </w:r>
+      <w:r>
+        <w:rPr>
+          <w:bCs/>
+          <w:b/>
+        </w:rPr>
+        <w:t xml:space="preserve">$266,000</w:t>
+      </w:r>
+      <w:r>
+        <w:t xml:space="preserve"> </w:t>
+      </w:r>
+      <w:r>
+        <w:t xml:space="preserve">(junio a diciembre, 7 meses), sujeto a incremento en función del desempeño de ventas del arrendatario.</w:t>
       </w:r>
     </w:p>
     <w:p>
@@ -966,13 +998,14 @@
         <w:jc w:val="start"/>
       </w:tblPr>
       <w:tblGrid>
-        <w:gridCol w:w="1131"/>
-        <w:gridCol w:w="1131"/>
-        <w:gridCol w:w="1131"/>
-        <w:gridCol w:w="1131"/>
-        <w:gridCol w:w="1131"/>
-        <w:gridCol w:w="1131"/>
-        <w:gridCol w:w="1131"/>
+        <w:gridCol w:w="990"/>
+        <w:gridCol w:w="990"/>
+        <w:gridCol w:w="990"/>
+        <w:gridCol w:w="990"/>
+        <w:gridCol w:w="990"/>
+        <w:gridCol w:w="990"/>
+        <w:gridCol w:w="990"/>
+        <w:gridCol w:w="990"/>
       </w:tblGrid>
       <w:tr>
         <w:trPr>
@@ -1034,7 +1067,19 @@
               <w:jc w:val="left"/>
             </w:pPr>
             <w:r>
-              <w:t xml:space="preserve">Ingreso anual proyectado</w:t>
+              <w:t xml:space="preserve">Período 2026</w:t>
+            </w:r>
+          </w:p>
+        </w:tc>
+        <w:tc>
+          <w:tcPr/>
+          <w:p>
+            <w:pPr>
+              <w:pStyle w:val="Compact"/>
+              <w:jc w:val="left"/>
+            </w:pPr>
+            <w:r>
+              <w:t xml:space="preserve">Ingreso efectivo 2026</w:t>
             </w:r>
           </w:p>
         </w:tc>
@@ -1120,19 +1165,31 @@
               <w:jc w:val="left"/>
             </w:pPr>
             <w:r>
-              <w:t xml:space="preserve">$456,000</w:t>
-            </w:r>
-          </w:p>
-        </w:tc>
-        <w:tc>
-          <w:tcPr/>
-          <w:p>
-            <w:pPr>
-              <w:pStyle w:val="Compact"/>
-              <w:jc w:val="left"/>
-            </w:pPr>
-            <w:r>
-              <w:t xml:space="preserve">22.8%</w:t>
+              <w:t xml:space="preserve">Jun – Dic (7 meses)</w:t>
+            </w:r>
+          </w:p>
+        </w:tc>
+        <w:tc>
+          <w:tcPr/>
+          <w:p>
+            <w:pPr>
+              <w:pStyle w:val="Compact"/>
+              <w:jc w:val="left"/>
+            </w:pPr>
+            <w:r>
+              <w:t xml:space="preserve">$266,000</w:t>
+            </w:r>
+          </w:p>
+        </w:tc>
+        <w:tc>
+          <w:tcPr/>
+          <w:p>
+            <w:pPr>
+              <w:pStyle w:val="Compact"/>
+              <w:jc w:val="left"/>
+            </w:pPr>
+            <w:r>
+              <w:t xml:space="preserve">13.3%</w:t>
             </w:r>
           </w:p>
         </w:tc>
@@ -1148,7 +1205,7 @@
                 <w:bCs/>
                 <w:b/>
               </w:rPr>
-              <w:t xml:space="preserve">91.2%</w:t>
+              <w:t xml:space="preserve">53.2%</w:t>
             </w:r>
           </w:p>
         </w:tc>
@@ -1179,7 +1236,7 @@
         <w:t xml:space="preserve"> </w:t>
       </w:r>
       <w:r>
-        <w:t xml:space="preserve">- Con el contrato firmado de Circle K, el área genera el</w:t>
+        <w:t xml:space="preserve">- Considerando el período de vigencia del contrato en 2026 (junio a diciembre, 7 meses), el ingreso efectivo de Circle K asciende a</w:t>
       </w:r>
       <w:r>
         <w:t xml:space="preserve"> </w:t>
@@ -1189,13 +1246,10 @@
           <w:bCs/>
           <w:b/>
         </w:rPr>
-        <w:t xml:space="preserve">91.2%</w:t>
-      </w:r>
-      <w:r>
-        <w:t xml:space="preserve"> </w:t>
-      </w:r>
-      <w:r>
-        <w:t xml:space="preserve">del ingreso anualizado esperado para el primer trimestre, equivalente al</w:t>
+        <w:t xml:space="preserve">$266,000</w:t>
+      </w:r>
+      <w:r>
+        <w:t xml:space="preserve">, lo que representa el</w:t>
       </w:r>
       <w:r>
         <w:t xml:space="preserve"> </w:t>
@@ -1205,13 +1259,29 @@
           <w:bCs/>
           <w:b/>
         </w:rPr>
-        <w:t xml:space="preserve">22.8%</w:t>
+        <w:t xml:space="preserve">53.2%</w:t>
       </w:r>
       <w:r>
         <w:t xml:space="preserve"> </w:t>
       </w:r>
       <w:r>
-        <w:t xml:space="preserve">de la meta anual de $2,000,000.</w:t>
+        <w:t xml:space="preserve">de la meta de ingresos del 1Q y el</w:t>
+      </w:r>
+      <w:r>
+        <w:t xml:space="preserve"> </w:t>
+      </w:r>
+      <w:r>
+        <w:rPr>
+          <w:bCs/>
+          <w:b/>
+        </w:rPr>
+        <w:t xml:space="preserve">13.3%</w:t>
+      </w:r>
+      <w:r>
+        <w:t xml:space="preserve"> </w:t>
+      </w:r>
+      <w:r>
+        <w:t xml:space="preserve">de la meta anual de $2,000,000. La tasa mensual de $38,000 equivale a un ingreso anualizado de $456,000 en ejercicios completos.</w:t>
       </w:r>
     </w:p>
     <w:bookmarkEnd w:id="24"/>

</xml_diff>

<commit_message>
Update Circle K income to full 12-month calculation
https://claude.ai/code/session_01HbK9N3vZquubiFb3vE1Zm4
</commit_message>
<xml_diff>
--- a/Informe_Avance_1Q_2026_GVega.docx
+++ b/Informe_Avance_1Q_2026_GVega.docx
@@ -643,7 +643,7 @@
           <w:bCs/>
           <w:b/>
         </w:rPr>
-        <w:t xml:space="preserve">Cumplimiento de ingresos (Circle K, jun–dic 2026):</w:t>
+        <w:t xml:space="preserve">Cumplimiento de ingresos (Circle K, 12 meses):</w:t>
       </w:r>
     </w:p>
     <w:tbl>
@@ -695,19 +695,19 @@
               <w:jc w:val="left"/>
             </w:pPr>
             <w:r>
-              <w:t xml:space="preserve">Ingreso efectivo 2026 (7 meses)</w:t>
-            </w:r>
-          </w:p>
-        </w:tc>
-        <w:tc>
-          <w:tcPr/>
-          <w:p>
-            <w:pPr>
-              <w:pStyle w:val="Compact"/>
-              <w:jc w:val="left"/>
-            </w:pPr>
-            <w:r>
-              <w:t xml:space="preserve">$266,000</w:t>
+              <w:t xml:space="preserve">Ingreso anual proyectado</w:t>
+            </w:r>
+          </w:p>
+        </w:tc>
+        <w:tc>
+          <w:tcPr/>
+          <w:p>
+            <w:pPr>
+              <w:pStyle w:val="Compact"/>
+              <w:jc w:val="left"/>
+            </w:pPr>
+            <w:r>
+              <w:t xml:space="preserve">$456,000</w:t>
             </w:r>
           </w:p>
         </w:tc>
@@ -733,7 +733,7 @@
               <w:jc w:val="left"/>
             </w:pPr>
             <w:r>
-              <w:t xml:space="preserve">13.3%</w:t>
+              <w:t xml:space="preserve">22.8%</w:t>
             </w:r>
           </w:p>
         </w:tc>
@@ -759,7 +759,7 @@
               <w:jc w:val="left"/>
             </w:pPr>
             <w:r>
-              <w:t xml:space="preserve">53.2%</w:t>
+              <w:t xml:space="preserve">91.2%</w:t>
             </w:r>
           </w:p>
         </w:tc>

</xml_diff>